<commit_message>
Added Ambience and finished pos
</commit_message>
<xml_diff>
--- a/Assessment/Recording Details Template.docx
+++ b/Assessment/Recording Details Template.docx
@@ -210,6 +210,12 @@
                 <w:color w:val="000000" w:themeColor="text1"/>
               </w:rPr>
             </w:pPr>
+            <w:r>
+              <w:rPr>
+                <w:color w:val="000000" w:themeColor="text1"/>
+              </w:rPr>
+              <w:t>0.0</w:t>
+            </w:r>
           </w:p>
           <w:p>
             <w:pPr>
@@ -229,6 +235,12 @@
                 <w:color w:val="000000" w:themeColor="text1"/>
               </w:rPr>
             </w:pPr>
+            <w:r>
+              <w:rPr>
+                <w:color w:val="000000" w:themeColor="text1"/>
+              </w:rPr>
+              <w:t>Zoom Audio Recorder</w:t>
+            </w:r>
           </w:p>
         </w:tc>
         <w:tc>
@@ -241,6 +253,24 @@
                 <w:color w:val="000000" w:themeColor="text1"/>
               </w:rPr>
             </w:pPr>
+            <w:r>
+              <w:rPr>
+                <w:color w:val="000000" w:themeColor="text1"/>
+              </w:rPr>
+              <w:t>1</w:t>
+            </w:r>
+            <w:r>
+              <w:rPr>
+                <w:color w:val="000000" w:themeColor="text1"/>
+              </w:rPr>
+              <w:t>1</w:t>
+            </w:r>
+            <w:r>
+              <w:rPr>
+                <w:color w:val="000000" w:themeColor="text1"/>
+              </w:rPr>
+              <w:t>/25</w:t>
+            </w:r>
           </w:p>
         </w:tc>
         <w:tc>
@@ -253,6 +283,12 @@
                 <w:color w:val="000000" w:themeColor="text1"/>
               </w:rPr>
             </w:pPr>
+            <w:r>
+              <w:rPr>
+                <w:color w:val="000000" w:themeColor="text1"/>
+              </w:rPr>
+              <w:t>Bournemouth University.</w:t>
+            </w:r>
           </w:p>
         </w:tc>
         <w:tc>
@@ -265,6 +301,12 @@
                 <w:color w:val="000000" w:themeColor="text1"/>
               </w:rPr>
             </w:pPr>
+            <w:r>
+              <w:rPr>
+                <w:color w:val="000000" w:themeColor="text1"/>
+              </w:rPr>
+              <w:t>Shoe slap. Intended for footstep audio but unused.</w:t>
+            </w:r>
           </w:p>
         </w:tc>
       </w:tr>
@@ -279,6 +321,12 @@
                 <w:color w:val="000000" w:themeColor="text1"/>
               </w:rPr>
             </w:pPr>
+            <w:r>
+              <w:rPr>
+                <w:color w:val="000000" w:themeColor="text1"/>
+              </w:rPr>
+              <w:t>1.0</w:t>
+            </w:r>
           </w:p>
           <w:p>
             <w:pPr>
@@ -298,6 +346,18 @@
                 <w:color w:val="000000" w:themeColor="text1"/>
               </w:rPr>
             </w:pPr>
+            <w:r>
+              <w:rPr>
+                <w:color w:val="000000" w:themeColor="text1"/>
+              </w:rPr>
+              <w:t>iPhone</w:t>
+            </w:r>
+            <w:r>
+              <w:rPr>
+                <w:color w:val="000000" w:themeColor="text1"/>
+              </w:rPr>
+              <w:t xml:space="preserve"> (Voice memos)</w:t>
+            </w:r>
           </w:p>
         </w:tc>
         <w:tc>
@@ -310,6 +370,12 @@
                 <w:color w:val="000000" w:themeColor="text1"/>
               </w:rPr>
             </w:pPr>
+            <w:r>
+              <w:rPr>
+                <w:color w:val="000000" w:themeColor="text1"/>
+              </w:rPr>
+              <w:t>4/1/26</w:t>
+            </w:r>
           </w:p>
         </w:tc>
         <w:tc>
@@ -322,6 +388,12 @@
                 <w:color w:val="000000" w:themeColor="text1"/>
               </w:rPr>
             </w:pPr>
+            <w:r>
+              <w:rPr>
+                <w:color w:val="000000" w:themeColor="text1"/>
+              </w:rPr>
+              <w:t>Back garden.</w:t>
+            </w:r>
           </w:p>
         </w:tc>
         <w:tc>
@@ -334,6 +406,12 @@
                 <w:color w:val="000000" w:themeColor="text1"/>
               </w:rPr>
             </w:pPr>
+            <w:r>
+              <w:rPr>
+                <w:color w:val="000000" w:themeColor="text1"/>
+              </w:rPr>
+              <w:t>Eucalyptus bark snapping. Used in ambience audio.</w:t>
+            </w:r>
           </w:p>
         </w:tc>
       </w:tr>
@@ -348,6 +426,12 @@
                 <w:color w:val="000000" w:themeColor="text1"/>
               </w:rPr>
             </w:pPr>
+            <w:r>
+              <w:rPr>
+                <w:color w:val="000000" w:themeColor="text1"/>
+              </w:rPr>
+              <w:t>3.0</w:t>
+            </w:r>
           </w:p>
           <w:p>
             <w:pPr>
@@ -367,6 +451,18 @@
                 <w:color w:val="000000" w:themeColor="text1"/>
               </w:rPr>
             </w:pPr>
+            <w:r>
+              <w:rPr>
+                <w:color w:val="000000" w:themeColor="text1"/>
+              </w:rPr>
+              <w:t>iPhone</w:t>
+            </w:r>
+            <w:r>
+              <w:rPr>
+                <w:color w:val="000000" w:themeColor="text1"/>
+              </w:rPr>
+              <w:t xml:space="preserve"> (Voice memos)</w:t>
+            </w:r>
           </w:p>
         </w:tc>
         <w:tc>
@@ -379,6 +475,12 @@
                 <w:color w:val="000000" w:themeColor="text1"/>
               </w:rPr>
             </w:pPr>
+            <w:r>
+              <w:rPr>
+                <w:color w:val="000000" w:themeColor="text1"/>
+              </w:rPr>
+              <w:t>4/1/26</w:t>
+            </w:r>
           </w:p>
         </w:tc>
         <w:tc>
@@ -391,6 +493,12 @@
                 <w:color w:val="000000" w:themeColor="text1"/>
               </w:rPr>
             </w:pPr>
+            <w:r>
+              <w:rPr>
+                <w:color w:val="000000" w:themeColor="text1"/>
+              </w:rPr>
+              <w:t>Back garden.</w:t>
+            </w:r>
           </w:p>
         </w:tc>
         <w:tc>
@@ -403,6 +511,1110 @@
                 <w:color w:val="000000" w:themeColor="text1"/>
               </w:rPr>
             </w:pPr>
+            <w:r>
+              <w:rPr>
+                <w:color w:val="000000" w:themeColor="text1"/>
+              </w:rPr>
+              <w:t>Sound of leaves shaking in the wind. Used in ambience audio.</w:t>
+            </w:r>
+          </w:p>
+        </w:tc>
+      </w:tr>
+      <w:tr>
+        <w:tc>
+          <w:tcPr>
+            <w:tcW w:w="1378" w:type="dxa"/>
+          </w:tcPr>
+          <w:p>
+            <w:pPr>
+              <w:rPr>
+                <w:color w:val="000000" w:themeColor="text1"/>
+              </w:rPr>
+            </w:pPr>
+            <w:r>
+              <w:rPr>
+                <w:color w:val="000000" w:themeColor="text1"/>
+              </w:rPr>
+              <w:t>6.0</w:t>
+            </w:r>
+          </w:p>
+        </w:tc>
+        <w:tc>
+          <w:tcPr>
+            <w:tcW w:w="1547" w:type="dxa"/>
+          </w:tcPr>
+          <w:p>
+            <w:pPr>
+              <w:rPr>
+                <w:color w:val="000000" w:themeColor="text1"/>
+              </w:rPr>
+            </w:pPr>
+            <w:r>
+              <w:rPr>
+                <w:color w:val="000000" w:themeColor="text1"/>
+              </w:rPr>
+              <w:t>iPhone</w:t>
+            </w:r>
+            <w:r>
+              <w:rPr>
+                <w:color w:val="000000" w:themeColor="text1"/>
+              </w:rPr>
+              <w:t xml:space="preserve"> (Voice memos)</w:t>
+            </w:r>
+          </w:p>
+        </w:tc>
+        <w:tc>
+          <w:tcPr>
+            <w:tcW w:w="1231" w:type="dxa"/>
+          </w:tcPr>
+          <w:p>
+            <w:pPr>
+              <w:rPr>
+                <w:color w:val="000000" w:themeColor="text1"/>
+              </w:rPr>
+            </w:pPr>
+            <w:r>
+              <w:rPr>
+                <w:color w:val="000000" w:themeColor="text1"/>
+              </w:rPr>
+              <w:t>4/1/26</w:t>
+            </w:r>
+          </w:p>
+        </w:tc>
+        <w:tc>
+          <w:tcPr>
+            <w:tcW w:w="2222" w:type="dxa"/>
+          </w:tcPr>
+          <w:p>
+            <w:pPr>
+              <w:rPr>
+                <w:color w:val="000000" w:themeColor="text1"/>
+              </w:rPr>
+            </w:pPr>
+            <w:r>
+              <w:rPr>
+                <w:color w:val="000000" w:themeColor="text1"/>
+              </w:rPr>
+              <w:t>Back garden.</w:t>
+            </w:r>
+          </w:p>
+        </w:tc>
+        <w:tc>
+          <w:tcPr>
+            <w:tcW w:w="3228" w:type="dxa"/>
+          </w:tcPr>
+          <w:p>
+            <w:pPr>
+              <w:rPr>
+                <w:color w:val="000000" w:themeColor="text1"/>
+              </w:rPr>
+            </w:pPr>
+            <w:r>
+              <w:rPr>
+                <w:color w:val="000000" w:themeColor="text1"/>
+              </w:rPr>
+              <w:t>Sound of a pile of sticks creaking under some weight. Used in ambience audio.</w:t>
+            </w:r>
+          </w:p>
+        </w:tc>
+      </w:tr>
+      <w:tr>
+        <w:tc>
+          <w:tcPr>
+            <w:tcW w:w="1378" w:type="dxa"/>
+          </w:tcPr>
+          <w:p>
+            <w:pPr>
+              <w:rPr>
+                <w:color w:val="000000" w:themeColor="text1"/>
+              </w:rPr>
+            </w:pPr>
+            <w:r>
+              <w:rPr>
+                <w:color w:val="000000" w:themeColor="text1"/>
+              </w:rPr>
+              <w:t>9.0</w:t>
+            </w:r>
+          </w:p>
+        </w:tc>
+        <w:tc>
+          <w:tcPr>
+            <w:tcW w:w="1547" w:type="dxa"/>
+          </w:tcPr>
+          <w:p>
+            <w:pPr>
+              <w:rPr>
+                <w:color w:val="000000" w:themeColor="text1"/>
+              </w:rPr>
+            </w:pPr>
+            <w:r>
+              <w:rPr>
+                <w:color w:val="000000" w:themeColor="text1"/>
+              </w:rPr>
+              <w:t>Zoom Audio Recorder</w:t>
+            </w:r>
+          </w:p>
+        </w:tc>
+        <w:tc>
+          <w:tcPr>
+            <w:tcW w:w="1231" w:type="dxa"/>
+          </w:tcPr>
+          <w:p>
+            <w:pPr>
+              <w:rPr>
+                <w:color w:val="000000" w:themeColor="text1"/>
+              </w:rPr>
+            </w:pPr>
+            <w:r>
+              <w:rPr>
+                <w:color w:val="000000" w:themeColor="text1"/>
+              </w:rPr>
+              <w:t>12/25</w:t>
+            </w:r>
+          </w:p>
+        </w:tc>
+        <w:tc>
+          <w:tcPr>
+            <w:tcW w:w="2222" w:type="dxa"/>
+          </w:tcPr>
+          <w:p>
+            <w:pPr>
+              <w:rPr>
+                <w:color w:val="000000" w:themeColor="text1"/>
+              </w:rPr>
+            </w:pPr>
+            <w:r>
+              <w:rPr>
+                <w:color w:val="000000" w:themeColor="text1"/>
+              </w:rPr>
+              <w:t>Bournemouth University.</w:t>
+            </w:r>
+          </w:p>
+        </w:tc>
+        <w:tc>
+          <w:tcPr>
+            <w:tcW w:w="3228" w:type="dxa"/>
+          </w:tcPr>
+          <w:p>
+            <w:pPr>
+              <w:rPr>
+                <w:color w:val="000000" w:themeColor="text1"/>
+              </w:rPr>
+            </w:pPr>
+            <w:r>
+              <w:rPr>
+                <w:color w:val="000000" w:themeColor="text1"/>
+              </w:rPr>
+              <w:t>Switch sound. Intended for HUD UI but unused.</w:t>
+            </w:r>
+          </w:p>
+        </w:tc>
+      </w:tr>
+      <w:tr>
+        <w:tc>
+          <w:tcPr>
+            <w:tcW w:w="1378" w:type="dxa"/>
+          </w:tcPr>
+          <w:p>
+            <w:pPr>
+              <w:rPr>
+                <w:color w:val="000000" w:themeColor="text1"/>
+              </w:rPr>
+            </w:pPr>
+            <w:r>
+              <w:rPr>
+                <w:color w:val="000000" w:themeColor="text1"/>
+              </w:rPr>
+              <w:t>12.0</w:t>
+            </w:r>
+          </w:p>
+        </w:tc>
+        <w:tc>
+          <w:tcPr>
+            <w:tcW w:w="1547" w:type="dxa"/>
+          </w:tcPr>
+          <w:p>
+            <w:pPr>
+              <w:rPr>
+                <w:color w:val="000000" w:themeColor="text1"/>
+              </w:rPr>
+            </w:pPr>
+            <w:r>
+              <w:rPr>
+                <w:color w:val="000000" w:themeColor="text1"/>
+              </w:rPr>
+              <w:t>iPhone</w:t>
+            </w:r>
+            <w:r>
+              <w:rPr>
+                <w:color w:val="000000" w:themeColor="text1"/>
+              </w:rPr>
+              <w:t xml:space="preserve"> (Voice memos)</w:t>
+            </w:r>
+          </w:p>
+        </w:tc>
+        <w:tc>
+          <w:tcPr>
+            <w:tcW w:w="1231" w:type="dxa"/>
+          </w:tcPr>
+          <w:p>
+            <w:pPr>
+              <w:rPr>
+                <w:color w:val="000000" w:themeColor="text1"/>
+              </w:rPr>
+            </w:pPr>
+            <w:r>
+              <w:rPr>
+                <w:color w:val="000000" w:themeColor="text1"/>
+              </w:rPr>
+              <w:t>30/12/25</w:t>
+            </w:r>
+          </w:p>
+        </w:tc>
+        <w:tc>
+          <w:tcPr>
+            <w:tcW w:w="2222" w:type="dxa"/>
+          </w:tcPr>
+          <w:p>
+            <w:pPr>
+              <w:rPr>
+                <w:color w:val="000000" w:themeColor="text1"/>
+              </w:rPr>
+            </w:pPr>
+            <w:r>
+              <w:rPr>
+                <w:color w:val="000000" w:themeColor="text1"/>
+              </w:rPr>
+              <w:t>Home bathroom.</w:t>
+            </w:r>
+          </w:p>
+        </w:tc>
+        <w:tc>
+          <w:tcPr>
+            <w:tcW w:w="3228" w:type="dxa"/>
+          </w:tcPr>
+          <w:p>
+            <w:pPr>
+              <w:rPr>
+                <w:color w:val="000000" w:themeColor="text1"/>
+              </w:rPr>
+            </w:pPr>
+            <w:r>
+              <w:rPr>
+                <w:color w:val="000000" w:themeColor="text1"/>
+              </w:rPr>
+              <w:t>Sound of a wet flannel. Used in the Slime SFX.</w:t>
+            </w:r>
+          </w:p>
+        </w:tc>
+      </w:tr>
+      <w:tr>
+        <w:tc>
+          <w:tcPr>
+            <w:tcW w:w="1378" w:type="dxa"/>
+          </w:tcPr>
+          <w:p>
+            <w:pPr>
+              <w:rPr>
+                <w:color w:val="000000" w:themeColor="text1"/>
+              </w:rPr>
+            </w:pPr>
+            <w:r>
+              <w:rPr>
+                <w:color w:val="000000" w:themeColor="text1"/>
+              </w:rPr>
+              <w:t>19.0</w:t>
+            </w:r>
+          </w:p>
+        </w:tc>
+        <w:tc>
+          <w:tcPr>
+            <w:tcW w:w="1547" w:type="dxa"/>
+          </w:tcPr>
+          <w:p>
+            <w:pPr>
+              <w:rPr>
+                <w:color w:val="000000" w:themeColor="text1"/>
+              </w:rPr>
+            </w:pPr>
+            <w:r>
+              <w:rPr>
+                <w:color w:val="000000" w:themeColor="text1"/>
+              </w:rPr>
+              <w:t>iPhone</w:t>
+            </w:r>
+            <w:r>
+              <w:rPr>
+                <w:color w:val="000000" w:themeColor="text1"/>
+              </w:rPr>
+              <w:t xml:space="preserve"> (Voice memos)</w:t>
+            </w:r>
+          </w:p>
+        </w:tc>
+        <w:tc>
+          <w:tcPr>
+            <w:tcW w:w="1231" w:type="dxa"/>
+          </w:tcPr>
+          <w:p>
+            <w:pPr>
+              <w:rPr>
+                <w:color w:val="000000" w:themeColor="text1"/>
+              </w:rPr>
+            </w:pPr>
+            <w:r>
+              <w:rPr>
+                <w:color w:val="000000" w:themeColor="text1"/>
+              </w:rPr>
+              <w:t>30/12/25</w:t>
+            </w:r>
+          </w:p>
+        </w:tc>
+        <w:tc>
+          <w:tcPr>
+            <w:tcW w:w="2222" w:type="dxa"/>
+          </w:tcPr>
+          <w:p>
+            <w:pPr>
+              <w:rPr>
+                <w:color w:val="000000" w:themeColor="text1"/>
+              </w:rPr>
+            </w:pPr>
+            <w:r>
+              <w:rPr>
+                <w:color w:val="000000" w:themeColor="text1"/>
+              </w:rPr>
+              <w:t>Home bathroom.</w:t>
+            </w:r>
+          </w:p>
+        </w:tc>
+        <w:tc>
+          <w:tcPr>
+            <w:tcW w:w="3228" w:type="dxa"/>
+          </w:tcPr>
+          <w:p>
+            <w:pPr>
+              <w:rPr>
+                <w:color w:val="000000" w:themeColor="text1"/>
+              </w:rPr>
+            </w:pPr>
+            <w:r>
+              <w:rPr>
+                <w:color w:val="000000" w:themeColor="text1"/>
+              </w:rPr>
+              <w:t>Sound of water dripping. Used in the Slime SFX.</w:t>
+            </w:r>
+          </w:p>
+        </w:tc>
+      </w:tr>
+      <w:tr>
+        <w:tc>
+          <w:tcPr>
+            <w:tcW w:w="1378" w:type="dxa"/>
+          </w:tcPr>
+          <w:p>
+            <w:pPr>
+              <w:rPr>
+                <w:color w:val="000000" w:themeColor="text1"/>
+              </w:rPr>
+            </w:pPr>
+            <w:r>
+              <w:rPr>
+                <w:color w:val="000000" w:themeColor="text1"/>
+              </w:rPr>
+              <w:t>22.0</w:t>
+            </w:r>
+          </w:p>
+        </w:tc>
+        <w:tc>
+          <w:tcPr>
+            <w:tcW w:w="1547" w:type="dxa"/>
+          </w:tcPr>
+          <w:p>
+            <w:pPr>
+              <w:rPr>
+                <w:color w:val="000000" w:themeColor="text1"/>
+              </w:rPr>
+            </w:pPr>
+            <w:r>
+              <w:rPr>
+                <w:color w:val="000000" w:themeColor="text1"/>
+              </w:rPr>
+              <w:t>Laptop Microphone (very quiet)</w:t>
+            </w:r>
+          </w:p>
+        </w:tc>
+        <w:tc>
+          <w:tcPr>
+            <w:tcW w:w="1231" w:type="dxa"/>
+          </w:tcPr>
+          <w:p>
+            <w:pPr>
+              <w:rPr>
+                <w:color w:val="000000" w:themeColor="text1"/>
+              </w:rPr>
+            </w:pPr>
+            <w:r>
+              <w:rPr>
+                <w:color w:val="000000" w:themeColor="text1"/>
+              </w:rPr>
+              <w:t>22/12/25</w:t>
+            </w:r>
+          </w:p>
+        </w:tc>
+        <w:tc>
+          <w:tcPr>
+            <w:tcW w:w="2222" w:type="dxa"/>
+          </w:tcPr>
+          <w:p>
+            <w:pPr>
+              <w:rPr>
+                <w:color w:val="000000" w:themeColor="text1"/>
+              </w:rPr>
+            </w:pPr>
+            <w:r>
+              <w:rPr>
+                <w:color w:val="000000" w:themeColor="text1"/>
+              </w:rPr>
+              <w:t>Home Bedroom.</w:t>
+            </w:r>
+          </w:p>
+        </w:tc>
+        <w:tc>
+          <w:tcPr>
+            <w:tcW w:w="3228" w:type="dxa"/>
+          </w:tcPr>
+          <w:p>
+            <w:pPr>
+              <w:rPr>
+                <w:color w:val="000000" w:themeColor="text1"/>
+              </w:rPr>
+            </w:pPr>
+            <w:r>
+              <w:rPr>
+                <w:color w:val="000000" w:themeColor="text1"/>
+              </w:rPr>
+              <w:t>Pen click sound. Used for HUD SFXs.</w:t>
+            </w:r>
+          </w:p>
+        </w:tc>
+      </w:tr>
+      <w:tr>
+        <w:tc>
+          <w:tcPr>
+            <w:tcW w:w="1378" w:type="dxa"/>
+          </w:tcPr>
+          <w:p>
+            <w:pPr>
+              <w:rPr>
+                <w:color w:val="000000" w:themeColor="text1"/>
+              </w:rPr>
+            </w:pPr>
+            <w:r>
+              <w:rPr>
+                <w:color w:val="000000" w:themeColor="text1"/>
+              </w:rPr>
+              <w:t>24.0</w:t>
+            </w:r>
+          </w:p>
+        </w:tc>
+        <w:tc>
+          <w:tcPr>
+            <w:tcW w:w="1547" w:type="dxa"/>
+          </w:tcPr>
+          <w:p>
+            <w:pPr>
+              <w:rPr>
+                <w:color w:val="000000" w:themeColor="text1"/>
+              </w:rPr>
+            </w:pPr>
+            <w:r>
+              <w:rPr>
+                <w:color w:val="000000" w:themeColor="text1"/>
+              </w:rPr>
+              <w:t>Logi Webcam Mic</w:t>
+            </w:r>
+          </w:p>
+        </w:tc>
+        <w:tc>
+          <w:tcPr>
+            <w:tcW w:w="1231" w:type="dxa"/>
+          </w:tcPr>
+          <w:p>
+            <w:pPr>
+              <w:rPr>
+                <w:color w:val="000000" w:themeColor="text1"/>
+              </w:rPr>
+            </w:pPr>
+            <w:r>
+              <w:rPr>
+                <w:color w:val="000000" w:themeColor="text1"/>
+              </w:rPr>
+              <w:t>28/12/25</w:t>
+            </w:r>
+          </w:p>
+        </w:tc>
+        <w:tc>
+          <w:tcPr>
+            <w:tcW w:w="2222" w:type="dxa"/>
+          </w:tcPr>
+          <w:p>
+            <w:pPr>
+              <w:rPr>
+                <w:color w:val="000000" w:themeColor="text1"/>
+              </w:rPr>
+            </w:pPr>
+            <w:r>
+              <w:rPr>
+                <w:color w:val="000000" w:themeColor="text1"/>
+              </w:rPr>
+              <w:t>Home Bedroom.</w:t>
+            </w:r>
+          </w:p>
+        </w:tc>
+        <w:tc>
+          <w:tcPr>
+            <w:tcW w:w="3228" w:type="dxa"/>
+          </w:tcPr>
+          <w:p>
+            <w:pPr>
+              <w:rPr>
+                <w:color w:val="000000" w:themeColor="text1"/>
+              </w:rPr>
+            </w:pPr>
+            <w:r>
+              <w:rPr>
+                <w:color w:val="000000" w:themeColor="text1"/>
+              </w:rPr>
+              <w:t xml:space="preserve">Bell chime. Recorded for Heart  </w:t>
+            </w:r>
+            <w:r>
+              <w:rPr>
+                <w:color w:val="000000" w:themeColor="text1"/>
+              </w:rPr>
+              <w:t>SFX</w:t>
+            </w:r>
+            <w:r>
+              <w:rPr>
+                <w:color w:val="000000" w:themeColor="text1"/>
+              </w:rPr>
+              <w:t>.</w:t>
+            </w:r>
+          </w:p>
+        </w:tc>
+      </w:tr>
+      <w:tr>
+        <w:tc>
+          <w:tcPr>
+            <w:tcW w:w="1378" w:type="dxa"/>
+          </w:tcPr>
+          <w:p>
+            <w:pPr>
+              <w:rPr>
+                <w:color w:val="000000" w:themeColor="text1"/>
+              </w:rPr>
+            </w:pPr>
+            <w:r>
+              <w:rPr>
+                <w:color w:val="000000" w:themeColor="text1"/>
+              </w:rPr>
+              <w:t>27.0</w:t>
+            </w:r>
+          </w:p>
+        </w:tc>
+        <w:tc>
+          <w:tcPr>
+            <w:tcW w:w="1547" w:type="dxa"/>
+          </w:tcPr>
+          <w:p>
+            <w:pPr>
+              <w:rPr>
+                <w:color w:val="000000" w:themeColor="text1"/>
+              </w:rPr>
+            </w:pPr>
+            <w:r>
+              <w:rPr>
+                <w:color w:val="000000" w:themeColor="text1"/>
+              </w:rPr>
+              <w:t>Logi Webcam Mic</w:t>
+            </w:r>
+          </w:p>
+        </w:tc>
+        <w:tc>
+          <w:tcPr>
+            <w:tcW w:w="1231" w:type="dxa"/>
+          </w:tcPr>
+          <w:p>
+            <w:pPr>
+              <w:rPr>
+                <w:color w:val="000000" w:themeColor="text1"/>
+              </w:rPr>
+            </w:pPr>
+            <w:r>
+              <w:rPr>
+                <w:color w:val="000000" w:themeColor="text1"/>
+              </w:rPr>
+              <w:t>28/12/25</w:t>
+            </w:r>
+          </w:p>
+        </w:tc>
+        <w:tc>
+          <w:tcPr>
+            <w:tcW w:w="2222" w:type="dxa"/>
+          </w:tcPr>
+          <w:p>
+            <w:pPr>
+              <w:rPr>
+                <w:color w:val="000000" w:themeColor="text1"/>
+              </w:rPr>
+            </w:pPr>
+            <w:r>
+              <w:rPr>
+                <w:color w:val="000000" w:themeColor="text1"/>
+              </w:rPr>
+              <w:t>Home Bedroom.</w:t>
+            </w:r>
+          </w:p>
+        </w:tc>
+        <w:tc>
+          <w:tcPr>
+            <w:tcW w:w="3228" w:type="dxa"/>
+          </w:tcPr>
+          <w:p>
+            <w:pPr>
+              <w:rPr>
+                <w:color w:val="000000" w:themeColor="text1"/>
+              </w:rPr>
+            </w:pPr>
+            <w:r>
+              <w:rPr>
+                <w:color w:val="000000" w:themeColor="text1"/>
+              </w:rPr>
+              <w:t>Key jingles</w:t>
+            </w:r>
+            <w:r>
+              <w:rPr>
+                <w:color w:val="000000" w:themeColor="text1"/>
+              </w:rPr>
+              <w:t xml:space="preserve">. Recorded for Heart </w:t>
+            </w:r>
+            <w:r>
+              <w:rPr>
+                <w:color w:val="000000" w:themeColor="text1"/>
+              </w:rPr>
+              <w:t>SFX.</w:t>
+            </w:r>
+          </w:p>
+        </w:tc>
+      </w:tr>
+      <w:tr>
+        <w:tc>
+          <w:tcPr>
+            <w:tcW w:w="1378" w:type="dxa"/>
+          </w:tcPr>
+          <w:p>
+            <w:pPr>
+              <w:rPr>
+                <w:color w:val="000000" w:themeColor="text1"/>
+              </w:rPr>
+            </w:pPr>
+            <w:r>
+              <w:rPr>
+                <w:color w:val="000000" w:themeColor="text1"/>
+              </w:rPr>
+              <w:t>31.0</w:t>
+            </w:r>
+          </w:p>
+        </w:tc>
+        <w:tc>
+          <w:tcPr>
+            <w:tcW w:w="1547" w:type="dxa"/>
+          </w:tcPr>
+          <w:p>
+            <w:pPr>
+              <w:rPr>
+                <w:color w:val="000000" w:themeColor="text1"/>
+              </w:rPr>
+            </w:pPr>
+            <w:r>
+              <w:rPr>
+                <w:color w:val="000000" w:themeColor="text1"/>
+              </w:rPr>
+              <w:t>Laptop Microphone</w:t>
+            </w:r>
+          </w:p>
+        </w:tc>
+        <w:tc>
+          <w:tcPr>
+            <w:tcW w:w="1231" w:type="dxa"/>
+          </w:tcPr>
+          <w:p>
+            <w:pPr>
+              <w:rPr>
+                <w:color w:val="000000" w:themeColor="text1"/>
+              </w:rPr>
+            </w:pPr>
+            <w:r>
+              <w:rPr>
+                <w:color w:val="000000" w:themeColor="text1"/>
+              </w:rPr>
+              <w:t>27/12/25</w:t>
+            </w:r>
+          </w:p>
+        </w:tc>
+        <w:tc>
+          <w:tcPr>
+            <w:tcW w:w="2222" w:type="dxa"/>
+          </w:tcPr>
+          <w:p>
+            <w:pPr>
+              <w:rPr>
+                <w:color w:val="000000" w:themeColor="text1"/>
+              </w:rPr>
+            </w:pPr>
+            <w:r>
+              <w:rPr>
+                <w:color w:val="000000" w:themeColor="text1"/>
+              </w:rPr>
+              <w:t>Home Bedroom.</w:t>
+            </w:r>
+          </w:p>
+        </w:tc>
+        <w:tc>
+          <w:tcPr>
+            <w:tcW w:w="3228" w:type="dxa"/>
+          </w:tcPr>
+          <w:p>
+            <w:pPr>
+              <w:rPr>
+                <w:color w:val="000000" w:themeColor="text1"/>
+              </w:rPr>
+            </w:pPr>
+            <w:r>
+              <w:rPr>
+                <w:color w:val="000000" w:themeColor="text1"/>
+              </w:rPr>
+              <w:t>Recorded for coin sound effect. Glass ping sound.</w:t>
+            </w:r>
+          </w:p>
+        </w:tc>
+      </w:tr>
+      <w:tr>
+        <w:tc>
+          <w:tcPr>
+            <w:tcW w:w="1378" w:type="dxa"/>
+          </w:tcPr>
+          <w:p>
+            <w:pPr>
+              <w:rPr>
+                <w:color w:val="000000" w:themeColor="text1"/>
+              </w:rPr>
+            </w:pPr>
+            <w:r>
+              <w:rPr>
+                <w:color w:val="000000" w:themeColor="text1"/>
+              </w:rPr>
+              <w:t>34.0</w:t>
+            </w:r>
+          </w:p>
+        </w:tc>
+        <w:tc>
+          <w:tcPr>
+            <w:tcW w:w="1547" w:type="dxa"/>
+          </w:tcPr>
+          <w:p>
+            <w:pPr>
+              <w:rPr>
+                <w:color w:val="000000" w:themeColor="text1"/>
+              </w:rPr>
+            </w:pPr>
+            <w:r>
+              <w:rPr>
+                <w:color w:val="000000" w:themeColor="text1"/>
+              </w:rPr>
+              <w:t>iPhone</w:t>
+            </w:r>
+            <w:r>
+              <w:rPr>
+                <w:color w:val="000000" w:themeColor="text1"/>
+              </w:rPr>
+              <w:t xml:space="preserve"> (Voice memos)</w:t>
+            </w:r>
+          </w:p>
+        </w:tc>
+        <w:tc>
+          <w:tcPr>
+            <w:tcW w:w="1231" w:type="dxa"/>
+          </w:tcPr>
+          <w:p>
+            <w:pPr>
+              <w:rPr>
+                <w:color w:val="000000" w:themeColor="text1"/>
+              </w:rPr>
+            </w:pPr>
+            <w:r>
+              <w:rPr>
+                <w:color w:val="000000" w:themeColor="text1"/>
+              </w:rPr>
+              <w:t>4/1/26</w:t>
+            </w:r>
+          </w:p>
+        </w:tc>
+        <w:tc>
+          <w:tcPr>
+            <w:tcW w:w="2222" w:type="dxa"/>
+          </w:tcPr>
+          <w:p>
+            <w:pPr>
+              <w:rPr>
+                <w:color w:val="000000" w:themeColor="text1"/>
+              </w:rPr>
+            </w:pPr>
+            <w:r>
+              <w:rPr>
+                <w:color w:val="000000" w:themeColor="text1"/>
+              </w:rPr>
+              <w:t>Back garden.</w:t>
+            </w:r>
+          </w:p>
+        </w:tc>
+        <w:tc>
+          <w:tcPr>
+            <w:tcW w:w="3228" w:type="dxa"/>
+          </w:tcPr>
+          <w:p>
+            <w:pPr>
+              <w:rPr>
+                <w:color w:val="000000" w:themeColor="text1"/>
+              </w:rPr>
+            </w:pPr>
+            <w:r>
+              <w:rPr>
+                <w:color w:val="000000" w:themeColor="text1"/>
+              </w:rPr>
+              <w:t>A person walking on concrete. Used for footstep SFXs.</w:t>
+            </w:r>
+          </w:p>
+        </w:tc>
+      </w:tr>
+      <w:tr>
+        <w:tc>
+          <w:tcPr>
+            <w:tcW w:w="1378" w:type="dxa"/>
+          </w:tcPr>
+          <w:p>
+            <w:pPr>
+              <w:rPr>
+                <w:color w:val="000000" w:themeColor="text1"/>
+              </w:rPr>
+            </w:pPr>
+            <w:r>
+              <w:rPr>
+                <w:color w:val="000000" w:themeColor="text1"/>
+              </w:rPr>
+              <w:t>39.0</w:t>
+            </w:r>
+          </w:p>
+        </w:tc>
+        <w:tc>
+          <w:tcPr>
+            <w:tcW w:w="1547" w:type="dxa"/>
+          </w:tcPr>
+          <w:p>
+            <w:pPr>
+              <w:rPr>
+                <w:color w:val="000000" w:themeColor="text1"/>
+              </w:rPr>
+            </w:pPr>
+            <w:proofErr w:type="spellStart"/>
+            <w:r>
+              <w:rPr>
+                <w:color w:val="000000" w:themeColor="text1"/>
+              </w:rPr>
+              <w:t>Iphone</w:t>
+            </w:r>
+            <w:proofErr w:type="spellEnd"/>
+            <w:r>
+              <w:rPr>
+                <w:color w:val="000000" w:themeColor="text1"/>
+              </w:rPr>
+              <w:t xml:space="preserve"> (Voice memos)</w:t>
+            </w:r>
+          </w:p>
+        </w:tc>
+        <w:tc>
+          <w:tcPr>
+            <w:tcW w:w="1231" w:type="dxa"/>
+          </w:tcPr>
+          <w:p>
+            <w:pPr>
+              <w:rPr>
+                <w:color w:val="000000" w:themeColor="text1"/>
+              </w:rPr>
+            </w:pPr>
+            <w:r>
+              <w:rPr>
+                <w:color w:val="000000" w:themeColor="text1"/>
+              </w:rPr>
+              <w:t>4/1/26</w:t>
+            </w:r>
+          </w:p>
+        </w:tc>
+        <w:tc>
+          <w:tcPr>
+            <w:tcW w:w="2222" w:type="dxa"/>
+          </w:tcPr>
+          <w:p>
+            <w:pPr>
+              <w:rPr>
+                <w:color w:val="000000" w:themeColor="text1"/>
+              </w:rPr>
+            </w:pPr>
+            <w:r>
+              <w:rPr>
+                <w:color w:val="000000" w:themeColor="text1"/>
+              </w:rPr>
+              <w:t>Back garden.</w:t>
+            </w:r>
+          </w:p>
+        </w:tc>
+        <w:tc>
+          <w:tcPr>
+            <w:tcW w:w="3228" w:type="dxa"/>
+          </w:tcPr>
+          <w:p>
+            <w:pPr>
+              <w:rPr>
+                <w:color w:val="000000" w:themeColor="text1"/>
+              </w:rPr>
+            </w:pPr>
+            <w:r>
+              <w:rPr>
+                <w:color w:val="000000" w:themeColor="text1"/>
+              </w:rPr>
+              <w:t xml:space="preserve">A person walking on </w:t>
+            </w:r>
+            <w:r>
+              <w:rPr>
+                <w:color w:val="000000" w:themeColor="text1"/>
+              </w:rPr>
+              <w:t>grass</w:t>
+            </w:r>
+            <w:r>
+              <w:rPr>
+                <w:color w:val="000000" w:themeColor="text1"/>
+              </w:rPr>
+              <w:t>. Used for footstep SFXs.</w:t>
+            </w:r>
+          </w:p>
+        </w:tc>
+      </w:tr>
+      <w:tr>
+        <w:tc>
+          <w:tcPr>
+            <w:tcW w:w="1378" w:type="dxa"/>
+          </w:tcPr>
+          <w:p>
+            <w:pPr>
+              <w:rPr>
+                <w:color w:val="000000" w:themeColor="text1"/>
+              </w:rPr>
+            </w:pPr>
+            <w:r>
+              <w:rPr>
+                <w:color w:val="000000" w:themeColor="text1"/>
+              </w:rPr>
+              <w:t>45.0</w:t>
+            </w:r>
+          </w:p>
+        </w:tc>
+        <w:tc>
+          <w:tcPr>
+            <w:tcW w:w="1547" w:type="dxa"/>
+          </w:tcPr>
+          <w:p>
+            <w:pPr>
+              <w:rPr>
+                <w:color w:val="000000" w:themeColor="text1"/>
+              </w:rPr>
+            </w:pPr>
+            <w:r>
+              <w:rPr>
+                <w:color w:val="000000" w:themeColor="text1"/>
+              </w:rPr>
+              <w:t>iPhone</w:t>
+            </w:r>
+            <w:r>
+              <w:rPr>
+                <w:color w:val="000000" w:themeColor="text1"/>
+              </w:rPr>
+              <w:t xml:space="preserve"> (Voice memos)</w:t>
+            </w:r>
+          </w:p>
+        </w:tc>
+        <w:tc>
+          <w:tcPr>
+            <w:tcW w:w="1231" w:type="dxa"/>
+          </w:tcPr>
+          <w:p>
+            <w:pPr>
+              <w:rPr>
+                <w:color w:val="000000" w:themeColor="text1"/>
+              </w:rPr>
+            </w:pPr>
+            <w:r>
+              <w:rPr>
+                <w:color w:val="000000" w:themeColor="text1"/>
+              </w:rPr>
+              <w:t>9/11/25</w:t>
+            </w:r>
+          </w:p>
+        </w:tc>
+        <w:tc>
+          <w:tcPr>
+            <w:tcW w:w="2222" w:type="dxa"/>
+          </w:tcPr>
+          <w:p>
+            <w:pPr>
+              <w:rPr>
+                <w:color w:val="000000" w:themeColor="text1"/>
+              </w:rPr>
+            </w:pPr>
+            <w:r>
+              <w:rPr>
+                <w:color w:val="000000" w:themeColor="text1"/>
+              </w:rPr>
+              <w:t>Front yard.</w:t>
+            </w:r>
+          </w:p>
+        </w:tc>
+        <w:tc>
+          <w:tcPr>
+            <w:tcW w:w="3228" w:type="dxa"/>
+          </w:tcPr>
+          <w:p>
+            <w:pPr>
+              <w:rPr>
+                <w:color w:val="000000" w:themeColor="text1"/>
+              </w:rPr>
+            </w:pPr>
+            <w:r>
+              <w:rPr>
+                <w:color w:val="000000" w:themeColor="text1"/>
+              </w:rPr>
+              <w:t xml:space="preserve">A person walking on </w:t>
+            </w:r>
+            <w:r>
+              <w:rPr>
+                <w:color w:val="000000" w:themeColor="text1"/>
+              </w:rPr>
+              <w:t>gravel</w:t>
+            </w:r>
+            <w:r>
+              <w:rPr>
+                <w:color w:val="000000" w:themeColor="text1"/>
+              </w:rPr>
+              <w:t>. Used for footstep SFXs.</w:t>
+            </w:r>
           </w:p>
         </w:tc>
       </w:tr>
@@ -1534,7 +2746,6 @@
   <w:style w:type="character" w:default="1" w:styleId="DefaultParagraphFont">
     <w:name w:val="Default Paragraph Font"/>
     <w:uiPriority w:val="1"/>
-    <w:semiHidden/>
     <w:unhideWhenUsed/>
   </w:style>
   <w:style w:type="table" w:default="1" w:styleId="TableNormal">

</xml_diff>